<commit_message>
updated text box properties
</commit_message>
<xml_diff>
--- a/PRDs/SnapMock-General-UI-PRD.docx
+++ b/PRDs/SnapMock-General-UI-PRD.docx
@@ -80,7 +80,7 @@
           <w:sz w:val="24"/>
           <w:szCs w:val="24"/>
         </w:rPr>
-        <w:t xml:space="preserve">Version 1.3</w:t>
+        <w:t xml:space="preserve">Version 1.4</w:t>
       </w:r>
     </w:p>
     <w:p>
@@ -93,7 +93,7 @@
           <w:sz w:val="24"/>
           <w:szCs w:val="24"/>
         </w:rPr>
-        <w:t xml:space="preserve">February 2026</w:t>
+        <w:t xml:space="preserve">March 2026</w:t>
       </w:r>
     </w:p>
     <w:p>
@@ -19951,7 +19951,7 @@
         <w:spacing w:after="120"/>
       </w:pPr>
       <w:r>
-        <w:t xml:space="preserve">The Property Panel is a context-sensitive inspector that shows and allows editing of the properties of the currently selected item(s). When no items are selected, it shows canvas/project properties. When multiple items of different types are selected, it shows only the properties they share in common.</w:t>
+        <w:t xml:space="preserve">The Property Panel is a context-sensitive inspector that shows and allows editing of the properties of the currently selected item(s). When a creation tool is active but no item is selected, it shows the tool’s default properties. When the Select tool is active and nothing is selected, it shows canvas/project properties. When multiple items of different types are selected, it shows only the properties they share in common.</w:t>
       </w:r>
     </w:p>
     <w:p>
@@ -20412,6 +20412,38 @@
       </w:pPr>
       <w:r>
         <w:t xml:space="preserve">8.5 Sections (When No Item is Selected)</w:t>
+      </w:r>
+    </w:p>
+    <w:p>
+      <w:pPr>
+        <w:spacing w:after="120"/>
+      </w:pPr>
+      <w:r>
+        <w:rPr>
+          <w:b/>
+          <w:bCs/>
+        </w:rPr>
+        <w:t xml:space="preserve">When a creation tool is active (any tool other than Select/Move):</w:t>
+      </w:r>
+    </w:p>
+    <w:p>
+      <w:pPr>
+        <w:spacing w:after="120"/>
+      </w:pPr>
+      <w:r>
+        <w:t xml:space="preserve">The Property Panel displays the tool-specific property sections populated with the tool’s current default values. This allows the user to review and configure settings such as stroke color, fill, font, or other tool-specific properties before creating an item. Changes made in this state update the tool defaults, which are applied to the next item created with that tool. Individual tool PRDs may specify additional behavior, such as which control receives initial focus.</w:t>
+      </w:r>
+    </w:p>
+    <w:p>
+      <w:pPr>
+        <w:spacing w:after="120"/>
+      </w:pPr>
+      <w:r>
+        <w:rPr>
+          <w:b/>
+          <w:bCs/>
+        </w:rPr>
+        <w:t xml:space="preserve">When the Select tool is active (or no tool is active):</w:t>
       </w:r>
     </w:p>
     <w:p>
@@ -28176,6 +28208,31 @@
       </w:pPr>
       <w:r>
         <w:t xml:space="preserve">18. Changelog</w:t>
+      </w:r>
+    </w:p>
+    <w:p>
+      <w:pPr>
+        <w:spacing w:after="120"/>
+      </w:pPr>
+      <w:r>
+        <w:rPr>
+          <w:b/>
+          <w:bCs/>
+        </w:rPr>
+        <w:t xml:space="preserve">Version 1.4 (March 2026)</w:t>
+      </w:r>
+    </w:p>
+    <w:p>
+      <w:pPr>
+        <w:pStyle w:val="ListParagraph"/>
+        <w:numPr>
+          <w:ilvl w:val="0"/>
+          <w:numId w:val="11"/>
+        </w:numPr>
+        <w:spacing w:after="60"/>
+      </w:pPr>
+      <w:r>
+        <w:t xml:space="preserve">Updated Section 8.1 (Purpose) and Section 8.5 to define Property Panel behavior when a creation tool is active: displays the tool’s default properties instead of canvas properties, allowing users to configure settings before creating an item. Canvas properties are now shown only when the Select tool is active and nothing is selected.</w:t>
       </w:r>
     </w:p>
     <w:p>

</xml_diff>

<commit_message>
Clear mypy strict errors, ruff warning, and adopt General UI PRD v1.6
- ColorSwatch.paintEvent accepts Optional QPaintEvent per Qt stubs
- RichTextMixin.set_line_height takes a LineHeightTypes enum default
- RasterCutCommand backups typed as RasterRegionItem
- PropertyPanel tool defaults typed as dict[str, Any]
- Remove unused variable in test_raster_operations
- General UI PRD v1.6 replaces v1.5 (universal Transparent color option)

Co-Authored-By: Claude Fable 5.1 <noreply@anthropic.com>
Claude-Session: https://claude.ai/code/session_018TfAAXdhQRZ8Q331V4iDs5
</commit_message>
<xml_diff>
--- a/PRDs/SnapMock-General-UI-PRD.docx
+++ b/PRDs/SnapMock-General-UI-PRD.docx
@@ -80,7 +80,7 @@
           <w:sz w:val="24"/>
           <w:szCs w:val="24"/>
         </w:rPr>
-        <w:t xml:space="preserve">Version 1.5</w:t>
+        <w:t xml:space="preserve">Version 1.6</w:t>
       </w:r>
     </w:p>
     <w:p>
@@ -16817,7 +16817,7 @@
                 <w:sz w:val="20"/>
                 <w:szCs w:val="20"/>
               </w:rPr>
-              <w:t xml:space="preserve">Click opens a color picker popover. Shows the current stroke color as a filled square. Right-click opens recent colors.</w:t>
+              <w:t xml:space="preserve">Click opens a color picker popover. Shows the current stroke color as a filled square. A small diagonal line through the swatch indicates the color is set to transparent. Right-click opens recent colors.</w:t>
             </w:r>
           </w:p>
         </w:tc>
@@ -16900,7 +16900,7 @@
                 <w:sz w:val="20"/>
                 <w:szCs w:val="20"/>
               </w:rPr>
-              <w:t xml:space="preserve">Same as stroke color but for fill. A small diagonal line through the swatch indicates "no fill" (transparent).</w:t>
+              <w:t xml:space="preserve">Same as stroke color but for fill. A small diagonal line through the swatch indicates the color is set to transparent.</w:t>
             </w:r>
           </w:p>
         </w:tc>
@@ -20485,7 +20485,7 @@
         <w:spacing w:after="60"/>
       </w:pPr>
       <w:r>
-        <w:t xml:space="preserve">Fill Color: color swatch + hex input (with no-fill toggle)</w:t>
+        <w:t xml:space="preserve">Fill Color: color swatch + hex input</w:t>
       </w:r>
     </w:p>
     <w:p>
@@ -22256,7 +22256,7 @@
         <w:spacing w:after="60"/>
       </w:pPr>
       <w:r>
-        <w:t xml:space="preserve">No-fill button: sets the color to transparent (only shown for fill color contexts).</w:t>
+        <w:t xml:space="preserve">Transparent option: a clearly labeled “Transparent” swatch or button that sets the color to fully transparent (alpha = 0). This option is available in all color picker contexts (stroke color, fill color, text color, etc.), providing a universal way to indicate no stroke, no fill, or no color.</w:t>
       </w:r>
     </w:p>
     <w:p>
@@ -27971,7 +27971,7 @@
         <w:spacing w:after="60"/>
       </w:pPr>
       <w:r>
-        <w:t xml:space="preserve">Fill color: transparent (no fill)</w:t>
+        <w:t xml:space="preserve">Fill color: transparent</w:t>
       </w:r>
     </w:p>
     <w:p>
@@ -28590,6 +28590,57 @@
       </w:pPr>
       <w:r>
         <w:t xml:space="preserve">18. Changelog</w:t>
+      </w:r>
+    </w:p>
+    <w:p>
+      <w:pPr>
+        <w:spacing w:after="120"/>
+      </w:pPr>
+      <w:r>
+        <w:rPr>
+          <w:b/>
+          <w:bCs/>
+        </w:rPr>
+        <w:t xml:space="preserve">Version 1.6 (March 2026)</w:t>
+      </w:r>
+    </w:p>
+    <w:p>
+      <w:pPr>
+        <w:pStyle w:val="ListParagraph"/>
+        <w:numPr>
+          <w:ilvl w:val="0"/>
+          <w:numId w:val="44"/>
+        </w:numPr>
+        <w:spacing w:after="60"/>
+      </w:pPr>
+      <w:r>
+        <w:t xml:space="preserve">Replaced the No-fill button in the Color Picker (Section 11.1) with a universal “Transparent” option available in all color picker contexts (stroke, fill, text, etc.), setting the color to fully transparent (alpha = 0).</w:t>
+      </w:r>
+    </w:p>
+    <w:p>
+      <w:pPr>
+        <w:pStyle w:val="ListParagraph"/>
+        <w:numPr>
+          <w:ilvl w:val="0"/>
+          <w:numId w:val="44"/>
+        </w:numPr>
+        <w:spacing w:after="60"/>
+      </w:pPr>
+      <w:r>
+        <w:t xml:space="preserve">Updated Stroke Color and Fill Color swatch descriptions to show diagonal-line indicator when set to transparent.</w:t>
+      </w:r>
+    </w:p>
+    <w:p>
+      <w:pPr>
+        <w:pStyle w:val="ListParagraph"/>
+        <w:numPr>
+          <w:ilvl w:val="0"/>
+          <w:numId w:val="44"/>
+        </w:numPr>
+        <w:spacing w:after="60"/>
+      </w:pPr>
+      <w:r>
+        <w:t xml:space="preserve">Removed no-fill toggle from Property Panel Fill Color control; transparent is now selected via the color picker like any other color.</w:t>
       </w:r>
     </w:p>
     <w:p>

</xml_diff>

<commit_message>
Align General UI PRD v1.6 cover with the other revised PRDs
Cover date March 2026 -> September 2026, Last Updated line added, and
the v1.6 changelog heading carries the same month. No content changes.

Co-Authored-By: Claude Fable 5.1 <noreply@anthropic.com>
Claude-Session: https://claude.ai/code/session_01MHnFhcbDv3vWQS4eWQneAV
</commit_message>
<xml_diff>
--- a/PRDs/SnapMock-General-UI-PRD.docx
+++ b/PRDs/SnapMock-General-UI-PRD.docx
@@ -93,7 +93,20 @@
           <w:sz w:val="24"/>
           <w:szCs w:val="24"/>
         </w:rPr>
-        <w:t xml:space="preserve">March 2026</w:t>
+        <w:t>September 2026</w:t>
+      </w:r>
+    </w:p>
+    <w:p>
+      <w:pPr>
+        <w:jc w:val="center"/>
+      </w:pPr>
+      <w:r>
+        <w:rPr>
+          <w:color w:val="888888"/>
+          <w:sz w:val="24"/>
+          <w:szCs w:val="24"/>
+        </w:rPr>
+        <w:t>Last Updated: 09-07-26 19:05</w:t>
       </w:r>
     </w:p>
     <w:p>
@@ -28601,7 +28614,7 @@
           <w:b/>
           <w:bCs/>
         </w:rPr>
-        <w:t xml:space="preserve">Version 1.6 (March 2026)</w:t>
+        <w:t>Version 1.6 (September 2026)</w:t>
       </w:r>
     </w:p>
     <w:p>

</xml_diff>